<commit_message>
Recurso inominado — proc. 0003504-56.2026.8.05.0141 (C6; origem do vínculo, ausência de contrato); itálicos corrigidos nos recursos anteriores
Co-Authored-By: Claude Sonnet 5.5 <noreply@anthropic.com>
Claude-Session: https://claude.ai/code/session_019TNd3owL3puNSae7yD12mR
</commit_message>
<xml_diff>
--- a/casos/0003528-84.2026.8.05.0141/recurso_inominado_conta_fraudulenta.docx
+++ b/casos/0003528-84.2026.8.05.0141/recurso_inominado_conta_fraudulenta.docx
@@ -35,28 +35,12 @@
       <w:r>
         <w:rPr>
           <w:rFonts w:ascii="Arial" w:cs="Arial" w:eastAsia="Arial" w:hAnsi="Arial"/>
-          <w:sz w:val="24"/>
-          <w:szCs w:val="24"/>
-        </w:rPr>
-        <w:t xml:space="preserve"/>
-      </w:r>
-      <w:r>
-        <w:rPr>
-          <w:rFonts w:ascii="Arial" w:cs="Arial" w:eastAsia="Arial" w:hAnsi="Arial"/>
           <w:b/>
           <w:bCs/>
           <w:sz w:val="24"/>
           <w:szCs w:val="24"/>
         </w:rPr>
         <w:t xml:space="preserve">Processo nº 0003528-84.2026.8.05.0141</w:t>
-      </w:r>
-      <w:r>
-        <w:rPr>
-          <w:rFonts w:ascii="Arial" w:cs="Arial" w:eastAsia="Arial" w:hAnsi="Arial"/>
-          <w:sz w:val="24"/>
-          <w:szCs w:val="24"/>
-        </w:rPr>
-        <w:t xml:space="preserve"/>
       </w:r>
     </w:p>
     <w:p>
@@ -68,14 +52,6 @@
       <w:r>
         <w:rPr>
           <w:rFonts w:ascii="Arial" w:cs="Arial" w:eastAsia="Arial" w:hAnsi="Arial"/>
-          <w:sz w:val="24"/>
-          <w:szCs w:val="24"/>
-        </w:rPr>
-        <w:t xml:space="preserve"/>
-      </w:r>
-      <w:r>
-        <w:rPr>
-          <w:rFonts w:ascii="Arial" w:cs="Arial" w:eastAsia="Arial" w:hAnsi="Arial"/>
           <w:b/>
           <w:bCs/>
           <w:sz w:val="24"/>
@@ -98,14 +74,6 @@
         <w:ind/>
         <w:jc w:val="left"/>
       </w:pPr>
-      <w:r>
-        <w:rPr>
-          <w:rFonts w:ascii="Arial" w:cs="Arial" w:eastAsia="Arial" w:hAnsi="Arial"/>
-          <w:sz w:val="24"/>
-          <w:szCs w:val="24"/>
-        </w:rPr>
-        <w:t xml:space="preserve"/>
-      </w:r>
       <w:r>
         <w:rPr>
           <w:rFonts w:ascii="Arial" w:cs="Arial" w:eastAsia="Arial" w:hAnsi="Arial"/>
@@ -201,14 +169,6 @@
       <w:r>
         <w:rPr>
           <w:rFonts w:ascii="Arial" w:cs="Arial" w:eastAsia="Arial" w:hAnsi="Arial"/>
-          <w:sz w:val="24"/>
-          <w:szCs w:val="24"/>
-        </w:rPr>
-        <w:t xml:space="preserve"/>
-      </w:r>
-      <w:r>
-        <w:rPr>
-          <w:rFonts w:ascii="Arial" w:cs="Arial" w:eastAsia="Arial" w:hAnsi="Arial"/>
           <w:b/>
           <w:bCs/>
           <w:sz w:val="24"/>
@@ -306,14 +266,6 @@
       <w:r>
         <w:rPr>
           <w:rFonts w:ascii="Arial" w:cs="Arial" w:eastAsia="Arial" w:hAnsi="Arial"/>
-          <w:sz w:val="24"/>
-          <w:szCs w:val="24"/>
-        </w:rPr>
-        <w:t xml:space="preserve"/>
-      </w:r>
-      <w:r>
-        <w:rPr>
-          <w:rFonts w:ascii="Arial" w:cs="Arial" w:eastAsia="Arial" w:hAnsi="Arial"/>
           <w:b/>
           <w:bCs/>
           <w:sz w:val="24"/>
@@ -357,14 +309,6 @@
       <w:r>
         <w:rPr>
           <w:rFonts w:ascii="Arial" w:cs="Arial" w:eastAsia="Arial" w:hAnsi="Arial"/>
-          <w:sz w:val="24"/>
-          <w:szCs w:val="24"/>
-        </w:rPr>
-        <w:t xml:space="preserve"/>
-      </w:r>
-      <w:r>
-        <w:rPr>
-          <w:rFonts w:ascii="Arial" w:cs="Arial" w:eastAsia="Arial" w:hAnsi="Arial"/>
           <w:b/>
           <w:bCs/>
           <w:sz w:val="24"/>
@@ -538,14 +482,6 @@
       <w:r>
         <w:rPr>
           <w:rFonts w:ascii="Arial" w:cs="Arial" w:eastAsia="Arial" w:hAnsi="Arial"/>
-          <w:sz w:val="24"/>
-          <w:szCs w:val="24"/>
-        </w:rPr>
-        <w:t xml:space="preserve"/>
-      </w:r>
-      <w:r>
-        <w:rPr>
-          <w:rFonts w:ascii="Arial" w:cs="Arial" w:eastAsia="Arial" w:hAnsi="Arial"/>
           <w:b/>
           <w:bCs/>
           <w:sz w:val="24"/>
@@ -571,14 +507,6 @@
       <w:r>
         <w:rPr>
           <w:rFonts w:ascii="Arial" w:cs="Arial" w:eastAsia="Arial" w:hAnsi="Arial"/>
-          <w:sz w:val="24"/>
-          <w:szCs w:val="24"/>
-        </w:rPr>
-        <w:t xml:space="preserve"/>
-      </w:r>
-      <w:r>
-        <w:rPr>
-          <w:rFonts w:ascii="Arial" w:cs="Arial" w:eastAsia="Arial" w:hAnsi="Arial"/>
           <w:b/>
           <w:bCs/>
           <w:sz w:val="24"/>
@@ -601,14 +529,6 @@
         <w:ind/>
         <w:jc w:val="left"/>
       </w:pPr>
-      <w:r>
-        <w:rPr>
-          <w:rFonts w:ascii="Arial" w:cs="Arial" w:eastAsia="Arial" w:hAnsi="Arial"/>
-          <w:sz w:val="24"/>
-          <w:szCs w:val="24"/>
-        </w:rPr>
-        <w:t xml:space="preserve"/>
-      </w:r>
       <w:r>
         <w:rPr>
           <w:rFonts w:ascii="Arial" w:cs="Arial" w:eastAsia="Arial" w:hAnsi="Arial"/>
@@ -658,28 +578,12 @@
       <w:r>
         <w:rPr>
           <w:rFonts w:ascii="Arial" w:cs="Arial" w:eastAsia="Arial" w:hAnsi="Arial"/>
-          <w:sz w:val="24"/>
-          <w:szCs w:val="24"/>
-        </w:rPr>
-        <w:t xml:space="preserve"/>
-      </w:r>
-      <w:r>
-        <w:rPr>
-          <w:rFonts w:ascii="Arial" w:cs="Arial" w:eastAsia="Arial" w:hAnsi="Arial"/>
           <w:b/>
           <w:bCs/>
           <w:sz w:val="24"/>
           <w:szCs w:val="24"/>
         </w:rPr>
         <w:t xml:space="preserve">Colenda Turma, Eméritos Julgadores,</w:t>
-      </w:r>
-      <w:r>
-        <w:rPr>
-          <w:rFonts w:ascii="Arial" w:cs="Arial" w:eastAsia="Arial" w:hAnsi="Arial"/>
-          <w:sz w:val="24"/>
-          <w:szCs w:val="24"/>
-        </w:rPr>
-        <w:t xml:space="preserve"/>
       </w:r>
     </w:p>
     <w:p>
@@ -775,20 +679,34 @@
       <w:r>
         <w:rPr>
           <w:rFonts w:ascii="Arial" w:cs="Arial" w:eastAsia="Arial" w:hAnsi="Arial"/>
-          <w:sz w:val="24"/>
-          <w:szCs w:val="24"/>
-        </w:rPr>
-        <w:t xml:space="preserve"/>
-      </w:r>
-      <w:r>
-        <w:rPr>
-          <w:rFonts w:ascii="Arial" w:cs="Arial" w:eastAsia="Arial" w:hAnsi="Arial"/>
-          <w:b/>
-          <w:bCs/>
-          <w:sz w:val="24"/>
-          <w:szCs w:val="24"/>
-        </w:rPr>
-        <w:t xml:space="preserve">A *ratio decidendi* atacada:</w:t>
+          <w:b/>
+          <w:bCs/>
+          <w:sz w:val="24"/>
+          <w:szCs w:val="24"/>
+        </w:rPr>
+        <w:t xml:space="preserve">A </w:t>
+      </w:r>
+      <w:r>
+        <w:rPr>
+          <w:rFonts w:ascii="Arial" w:cs="Arial" w:eastAsia="Arial" w:hAnsi="Arial"/>
+          <w:b/>
+          <w:bCs/>
+          <w:i/>
+          <w:iCs/>
+          <w:sz w:val="24"/>
+          <w:szCs w:val="24"/>
+        </w:rPr>
+        <w:t xml:space="preserve">ratio decidendi</w:t>
+      </w:r>
+      <w:r>
+        <w:rPr>
+          <w:rFonts w:ascii="Arial" w:cs="Arial" w:eastAsia="Arial" w:hAnsi="Arial"/>
+          <w:b/>
+          <w:bCs/>
+          <w:sz w:val="24"/>
+          <w:szCs w:val="24"/>
+        </w:rPr>
+        <w:t xml:space="preserve"> atacada:</w:t>
       </w:r>
       <w:r>
         <w:rPr>
@@ -1193,16 +1111,6 @@
             <w:r>
               <w:rPr>
                 <w:rFonts w:ascii="Arial" w:cs="Arial" w:eastAsia="Arial" w:hAnsi="Arial"/>
-                <w:b w:val="false"/>
-                <w:bCs w:val="false"/>
-                <w:sz w:val="20"/>
-                <w:szCs w:val="20"/>
-              </w:rPr>
-              <w:t xml:space="preserve"/>
-            </w:r>
-            <w:r>
-              <w:rPr>
-                <w:rFonts w:ascii="Arial" w:cs="Arial" w:eastAsia="Arial" w:hAnsi="Arial"/>
                 <w:b/>
                 <w:bCs/>
                 <w:sz w:val="20"/>
@@ -1615,7 +1523,25 @@
           <w:sz w:val="24"/>
           <w:szCs w:val="24"/>
         </w:rPr>
-        <w:t xml:space="preserve">: (i) danos morais *in re ipsa* (R$ 8.000,00) e (ii) desvio produtivo (R$ 2.000,00), com pedido de arbitramento nos termos do tópico IV.3.</w:t>
+        <w:t xml:space="preserve">: (i) danos morais </w:t>
+      </w:r>
+      <w:r>
+        <w:rPr>
+          <w:rFonts w:ascii="Arial" w:cs="Arial" w:eastAsia="Arial" w:hAnsi="Arial"/>
+          <w:i/>
+          <w:iCs/>
+          <w:sz w:val="24"/>
+          <w:szCs w:val="24"/>
+        </w:rPr>
+        <w:t xml:space="preserve">in re ipsa</w:t>
+      </w:r>
+      <w:r>
+        <w:rPr>
+          <w:rFonts w:ascii="Arial" w:cs="Arial" w:eastAsia="Arial" w:hAnsi="Arial"/>
+          <w:sz w:val="24"/>
+          <w:szCs w:val="24"/>
+        </w:rPr>
+        <w:t xml:space="preserve"> (R$ 8.000,00) e (ii) desvio produtivo (R$ 2.000,00), com pedido de arbitramento nos termos do tópico IV.3.</w:t>
       </w:r>
     </w:p>
     <w:tbl>
@@ -2617,14 +2543,6 @@
       <w:r>
         <w:rPr>
           <w:rFonts w:ascii="Arial" w:cs="Arial" w:eastAsia="Arial" w:hAnsi="Arial"/>
-          <w:sz w:val="24"/>
-          <w:szCs w:val="24"/>
-        </w:rPr>
-        <w:t xml:space="preserve"/>
-      </w:r>
-      <w:r>
-        <w:rPr>
-          <w:rFonts w:ascii="Arial" w:cs="Arial" w:eastAsia="Arial" w:hAnsi="Arial"/>
           <w:b/>
           <w:bCs/>
           <w:sz w:val="24"/>
@@ -2740,14 +2658,6 @@
       <w:r>
         <w:rPr>
           <w:rFonts w:ascii="Arial" w:cs="Arial" w:eastAsia="Arial" w:hAnsi="Arial"/>
-          <w:sz w:val="24"/>
-          <w:szCs w:val="24"/>
-        </w:rPr>
-        <w:t xml:space="preserve"/>
-      </w:r>
-      <w:r>
-        <w:rPr>
-          <w:rFonts w:ascii="Arial" w:cs="Arial" w:eastAsia="Arial" w:hAnsi="Arial"/>
           <w:b/>
           <w:bCs/>
           <w:sz w:val="24"/>
@@ -2779,7 +2689,25 @@
           <w:sz w:val="24"/>
           <w:szCs w:val="24"/>
         </w:rPr>
-        <w:t xml:space="preserve">. A sentença, homologada pela Juíza de Direito, reconheceu "dano *in re ipsa*, decorrente da própria constituição e manutenção, à revelia da titular, de relacionamento inserido em cadastro oficial do sistema financeiro nacional, circunstância apta a gerar fundada sensação de insegurança e exposição a riscos que escapam ao controle da consumidora, tais como bloqueios, movimentações não reconhecidas e utilização indevida de seus dados pessoais, </w:t>
+        <w:t xml:space="preserve">. A sentença, homologada pela Juíza de Direito, reconheceu "dano </w:t>
+      </w:r>
+      <w:r>
+        <w:rPr>
+          <w:rFonts w:ascii="Arial" w:cs="Arial" w:eastAsia="Arial" w:hAnsi="Arial"/>
+          <w:i/>
+          <w:iCs/>
+          <w:sz w:val="24"/>
+          <w:szCs w:val="24"/>
+        </w:rPr>
+        <w:t xml:space="preserve">in re ipsa</w:t>
+      </w:r>
+      <w:r>
+        <w:rPr>
+          <w:rFonts w:ascii="Arial" w:cs="Arial" w:eastAsia="Arial" w:hAnsi="Arial"/>
+          <w:sz w:val="24"/>
+          <w:szCs w:val="24"/>
+        </w:rPr>
+        <w:t xml:space="preserve">, decorrente da própria constituição e manutenção, à revelia da titular, de relacionamento inserido em cadastro oficial do sistema financeiro nacional, circunstância apta a gerar fundada sensação de insegurança e exposição a riscos que escapam ao controle da consumidora, tais como bloqueios, movimentações não reconhecidas e utilização indevida de seus dados pessoais, </w:t>
       </w:r>
       <w:r>
         <w:rPr>
@@ -3201,7 +3129,29 @@
                 <w:sz w:val="20"/>
                 <w:szCs w:val="20"/>
               </w:rPr>
-              <w:t xml:space="preserve">Conta aberta sem consentimento, registrada no CCS (dano *in re ipsa*)</w:t>
+              <w:t xml:space="preserve">Conta aberta sem consentimento, registrada no CCS (dano </w:t>
+            </w:r>
+            <w:r>
+              <w:rPr>
+                <w:rFonts w:ascii="Arial" w:cs="Arial" w:eastAsia="Arial" w:hAnsi="Arial"/>
+                <w:b w:val="false"/>
+                <w:bCs w:val="false"/>
+                <w:i/>
+                <w:iCs/>
+                <w:sz w:val="20"/>
+                <w:szCs w:val="20"/>
+              </w:rPr>
+              <w:t xml:space="preserve">in re ipsa</w:t>
+            </w:r>
+            <w:r>
+              <w:rPr>
+                <w:rFonts w:ascii="Arial" w:cs="Arial" w:eastAsia="Arial" w:hAnsi="Arial"/>
+                <w:b w:val="false"/>
+                <w:bCs w:val="false"/>
+                <w:sz w:val="20"/>
+                <w:szCs w:val="20"/>
+              </w:rPr>
+              <w:t xml:space="preserve">)</w:t>
             </w:r>
           </w:p>
         </w:tc>
@@ -3465,14 +3415,6 @@
       <w:r>
         <w:rPr>
           <w:rFonts w:ascii="Arial" w:cs="Arial" w:eastAsia="Arial" w:hAnsi="Arial"/>
-          <w:sz w:val="24"/>
-          <w:szCs w:val="24"/>
-        </w:rPr>
-        <w:t xml:space="preserve"/>
-      </w:r>
-      <w:r>
-        <w:rPr>
-          <w:rFonts w:ascii="Arial" w:cs="Arial" w:eastAsia="Arial" w:hAnsi="Arial"/>
           <w:b/>
           <w:bCs/>
           <w:sz w:val="24"/>
@@ -3516,14 +3458,6 @@
       <w:r>
         <w:rPr>
           <w:rFonts w:ascii="Arial" w:cs="Arial" w:eastAsia="Arial" w:hAnsi="Arial"/>
-          <w:sz w:val="24"/>
-          <w:szCs w:val="24"/>
-        </w:rPr>
-        <w:t xml:space="preserve"/>
-      </w:r>
-      <w:r>
-        <w:rPr>
-          <w:rFonts w:ascii="Arial" w:cs="Arial" w:eastAsia="Arial" w:hAnsi="Arial"/>
           <w:b/>
           <w:bCs/>
           <w:sz w:val="24"/>
@@ -3585,14 +3519,6 @@
       <w:r>
         <w:rPr>
           <w:rFonts w:ascii="Arial" w:cs="Arial" w:eastAsia="Arial" w:hAnsi="Arial"/>
-          <w:sz w:val="24"/>
-          <w:szCs w:val="24"/>
-        </w:rPr>
-        <w:t xml:space="preserve"/>
-      </w:r>
-      <w:r>
-        <w:rPr>
-          <w:rFonts w:ascii="Arial" w:cs="Arial" w:eastAsia="Arial" w:hAnsi="Arial"/>
           <w:b/>
           <w:bCs/>
           <w:sz w:val="24"/>
@@ -4424,14 +4350,6 @@
         <w:ind/>
         <w:jc w:val="both"/>
       </w:pPr>
-      <w:r>
-        <w:rPr>
-          <w:rFonts w:ascii="Arial" w:cs="Arial" w:eastAsia="Arial" w:hAnsi="Arial"/>
-          <w:sz w:val="24"/>
-          <w:szCs w:val="24"/>
-        </w:rPr>
-        <w:t xml:space="preserve"/>
-      </w:r>
       <w:r>
         <w:rPr>
           <w:rFonts w:ascii="Arial" w:cs="Arial" w:eastAsia="Arial" w:hAnsi="Arial"/>

</xml_diff>